<commit_message>
Tercer avance del informe
</commit_message>
<xml_diff>
--- a/Informe.docx
+++ b/Informe.docx
@@ -571,7 +571,7 @@
       <w:pPr>
         <w:numPr>
           <w:ilvl w:val="0"/>
-          <w:numId w:val="2"/>
+          <w:numId w:val="4"/>
         </w:numPr>
         <w:spacing w:after="0" w:afterAutospacing="0" w:before="240" w:line="276" w:lineRule="auto"/>
         <w:ind w:left="1440" w:hanging="360"/>
@@ -600,6 +600,76 @@
           <w:rtl w:val="0"/>
         </w:rPr>
         <w:t xml:space="preserve"> Registrar, buscar y ordenar dinámicamente las aplicaciones activas para mantener un control adecuado de cada proceso.</w:t>
+      </w:r>
+    </w:p>
+    <w:p>
+      <w:pPr>
+        <w:numPr>
+          <w:ilvl w:val="0"/>
+          <w:numId w:val="4"/>
+        </w:numPr>
+        <w:spacing w:after="0" w:afterAutospacing="0" w:before="0" w:beforeAutospacing="0" w:line="276" w:lineRule="auto"/>
+        <w:ind w:left="1440" w:hanging="360"/>
+        <w:rPr>
+          <w:rFonts w:ascii="Arial" w:cs="Arial" w:eastAsia="Arial" w:hAnsi="Arial"/>
+          <w:i w:val="1"/>
+          <w:iCs w:val="1"/>
+        </w:rPr>
+      </w:pPr>
+      <w:r>
+        <w:rPr>
+          <w:rFonts w:ascii="Arial" w:cs="Arial" w:eastAsia="Arial" w:hAnsi="Arial"/>
+          <w:b w:val="1"/>
+          <w:bCs w:val="1"/>
+          <w:i w:val="1"/>
+          <w:iCs w:val="1"/>
+          <w:rtl w:val="0"/>
+        </w:rPr>
+        <w:t xml:space="preserve">Priorización:</w:t>
+      </w:r>
+      <w:r>
+        <w:rPr>
+          <w:rFonts w:ascii="Arial" w:cs="Arial" w:eastAsia="Arial" w:hAnsi="Arial"/>
+          <w:i w:val="1"/>
+          <w:iCs w:val="1"/>
+          <w:rtl w:val="0"/>
+        </w:rPr>
+        <w:t xml:space="preserve"> Asegurar que los procesos críticos del sistema sean atendidos antes que las tareas secundarias del usuario, evitando retrasos en el uso de la CPU.</w:t>
+      </w:r>
+    </w:p>
+    <w:p>
+      <w:pPr>
+        <w:numPr>
+          <w:ilvl w:val="0"/>
+          <w:numId w:val="4"/>
+        </w:numPr>
+        <w:spacing w:after="0" w:afterAutospacing="0" w:before="0" w:beforeAutospacing="0" w:line="276" w:lineRule="auto"/>
+        <w:ind w:left="1440" w:hanging="360"/>
+        <w:rPr>
+          <w:rFonts w:ascii="Arial" w:cs="Arial" w:eastAsia="Arial" w:hAnsi="Arial"/>
+          <w:i w:val="1"/>
+          <w:iCs w:val="1"/>
+        </w:rPr>
+      </w:pPr>
+      <w:r>
+        <w:rPr>
+          <w:rFonts w:ascii="Arial" w:cs="Arial" w:eastAsia="Arial" w:hAnsi="Arial"/>
+          <w:b w:val="1"/>
+          <w:bCs w:val="1"/>
+          <w:i w:val="1"/>
+          <w:iCs w:val="1"/>
+          <w:rtl w:val="0"/>
+        </w:rPr>
+        <w:t xml:space="preserve">Control de memoria:</w:t>
+      </w:r>
+      <w:r>
+        <w:rPr>
+          <w:rFonts w:ascii="Arial" w:cs="Arial" w:eastAsia="Arial" w:hAnsi="Arial"/>
+          <w:i w:val="1"/>
+          <w:iCs w:val="1"/>
+          <w:rtl w:val="0"/>
+        </w:rPr>
+        <w:t xml:space="preserve"> Supervisar de manera precisa el consumo de memoria RAM de cada proceso, permitiendo asignar y liberar recursos de forma ordenada y eficiente.</w:t>
       </w:r>
     </w:p>
     <w:p>
@@ -608,68 +678,334 @@
           <w:ilvl w:val="0"/>
           <w:numId w:val="2"/>
         </w:numPr>
-        <w:spacing w:after="0" w:afterAutospacing="0" w:before="0" w:beforeAutospacing="0" w:line="276" w:lineRule="auto"/>
+        <w:spacing w:after="0" w:line="276" w:lineRule="auto"/>
         <w:ind w:left="1440" w:hanging="360"/>
+        <w:jc w:val="both"/>
         <w:rPr>
           <w:rFonts w:ascii="Arial" w:cs="Arial" w:eastAsia="Arial" w:hAnsi="Arial"/>
           <w:i w:val="1"/>
           <w:iCs w:val="1"/>
-        </w:rPr>
-      </w:pPr>
-      <w:r>
-        <w:rPr>
-          <w:rFonts w:ascii="Arial" w:cs="Arial" w:eastAsia="Arial" w:hAnsi="Arial"/>
-          <w:b w:val="1"/>
-          <w:bCs w:val="1"/>
-          <w:i w:val="1"/>
-          <w:iCs w:val="1"/>
-          <w:rtl w:val="0"/>
-        </w:rPr>
-        <w:t xml:space="preserve">Priorización:</w:t>
-      </w:r>
-      <w:r>
-        <w:rPr>
-          <w:rFonts w:ascii="Arial" w:cs="Arial" w:eastAsia="Arial" w:hAnsi="Arial"/>
-          <w:i w:val="1"/>
-          <w:iCs w:val="1"/>
-          <w:rtl w:val="0"/>
-        </w:rPr>
-        <w:t xml:space="preserve"> Asegurar que los procesos críticos del sistema sean atendidos antes que las tareas secundarias del usuario, evitando retrasos en el uso de la CPU.</w:t>
+          <w:u w:val="none"/>
+        </w:rPr>
+      </w:pPr>
+      <w:r>
+        <w:rPr>
+          <w:rtl w:val="0"/>
+        </w:rPr>
+      </w:r>
+    </w:p>
+    <w:p>
+      <w:pPr>
+        <w:spacing w:after="0" w:line="276" w:lineRule="auto"/>
+        <w:ind w:left="720" w:hanging="360"/>
+        <w:rPr>
+          <w:rFonts w:ascii="Arial" w:cs="Arial" w:eastAsia="Arial" w:hAnsi="Arial"/>
+          <w:b w:val="1"/>
+          <w:bCs w:val="1"/>
+        </w:rPr>
+      </w:pPr>
+      <w:r>
+        <w:rPr>
+          <w:rFonts w:ascii="Arial" w:cs="Arial" w:eastAsia="Arial" w:hAnsi="Arial"/>
+          <w:b w:val="1"/>
+          <w:bCs w:val="1"/>
+          <w:rtl w:val="0"/>
+        </w:rPr>
+        <w:t xml:space="preserve">2.</w:t>
+      </w:r>
+      <w:r>
+        <w:rPr>
+          <w:rFonts w:ascii="Arial" w:cs="Arial" w:eastAsia="Arial" w:hAnsi="Arial"/>
+          <w:rtl w:val="0"/>
+        </w:rPr>
+        <w:t xml:space="preserve">       </w:t>
+      </w:r>
+      <w:r>
+        <w:rPr>
+          <w:rFonts w:ascii="Arial" w:cs="Arial" w:eastAsia="Arial" w:hAnsi="Arial"/>
+          <w:b w:val="1"/>
+          <w:bCs w:val="1"/>
+          <w:rtl w:val="0"/>
+        </w:rPr>
+        <w:t xml:space="preserve">Requerimientos del sistema</w:t>
+      </w:r>
+    </w:p>
+    <w:p>
+      <w:pPr>
+        <w:spacing w:after="0" w:line="276" w:lineRule="auto"/>
+        <w:ind w:left="1080" w:hanging="360"/>
+        <w:rPr>
+          <w:rFonts w:ascii="Arial" w:cs="Arial" w:eastAsia="Arial" w:hAnsi="Arial"/>
+        </w:rPr>
+      </w:pPr>
+      <w:r>
+        <w:rPr>
+          <w:rFonts w:ascii="Arial" w:cs="Arial" w:eastAsia="Arial" w:hAnsi="Arial"/>
+          <w:rtl w:val="0"/>
+        </w:rPr>
+        <w:t xml:space="preserve">·         Funcionales</w:t>
       </w:r>
     </w:p>
     <w:p>
       <w:pPr>
         <w:numPr>
           <w:ilvl w:val="0"/>
-          <w:numId w:val="2"/>
+          <w:numId w:val="5"/>
         </w:numPr>
-        <w:spacing w:after="0" w:afterAutospacing="0" w:before="0" w:beforeAutospacing="0" w:line="276" w:lineRule="auto"/>
+        <w:spacing w:after="0" w:line="276" w:lineRule="auto"/>
         <w:ind w:left="1440" w:hanging="360"/>
         <w:rPr>
           <w:rFonts w:ascii="Arial" w:cs="Arial" w:eastAsia="Arial" w:hAnsi="Arial"/>
-          <w:i w:val="1"/>
-          <w:iCs w:val="1"/>
-        </w:rPr>
-      </w:pPr>
-      <w:r>
-        <w:rPr>
-          <w:rFonts w:ascii="Arial" w:cs="Arial" w:eastAsia="Arial" w:hAnsi="Arial"/>
-          <w:b w:val="1"/>
-          <w:bCs w:val="1"/>
-          <w:i w:val="1"/>
-          <w:iCs w:val="1"/>
-          <w:rtl w:val="0"/>
-        </w:rPr>
-        <w:t xml:space="preserve">Control de memoria:</w:t>
-      </w:r>
-      <w:r>
-        <w:rPr>
-          <w:rFonts w:ascii="Arial" w:cs="Arial" w:eastAsia="Arial" w:hAnsi="Arial"/>
-          <w:i w:val="1"/>
-          <w:iCs w:val="1"/>
-          <w:rtl w:val="0"/>
-        </w:rPr>
-        <w:t xml:space="preserve"> Supervisar de manera precisa el consumo de memoria RAM de cada proceso, permitiendo asignar y liberar recursos de forma ordenada y eficiente.</w:t>
+        </w:rPr>
+      </w:pPr>
+      <w:r>
+        <w:rPr>
+          <w:rFonts w:ascii="Arial" w:cs="Arial" w:eastAsia="Arial" w:hAnsi="Arial"/>
+          <w:b w:val="1"/>
+          <w:bCs w:val="1"/>
+          <w:rtl w:val="0"/>
+        </w:rPr>
+        <w:t xml:space="preserve">RF-01 (Registrar):</w:t>
+      </w:r>
+      <w:r>
+        <w:rPr>
+          <w:rFonts w:ascii="Arial" w:cs="Arial" w:eastAsia="Arial" w:hAnsi="Arial"/>
+          <w:rtl w:val="0"/>
+        </w:rPr>
+        <w:t xml:space="preserve"> El sistema permite al usuario ingresar nuevos procesos de manera dinámica con un ID único, nombre descriptivo y nivel de profundidad inicial.</w:t>
+      </w:r>
+    </w:p>
+    <w:p>
+      <w:pPr>
+        <w:numPr>
+          <w:ilvl w:val="0"/>
+          <w:numId w:val="5"/>
+        </w:numPr>
+        <w:spacing w:after="0" w:line="276" w:lineRule="auto"/>
+        <w:ind w:left="1440" w:hanging="360"/>
+        <w:rPr>
+          <w:rFonts w:ascii="Arial" w:cs="Arial" w:eastAsia="Arial" w:hAnsi="Arial"/>
+        </w:rPr>
+      </w:pPr>
+      <w:r>
+        <w:rPr>
+          <w:rFonts w:ascii="Arial" w:cs="Arial" w:eastAsia="Arial" w:hAnsi="Arial"/>
+          <w:b w:val="1"/>
+          <w:bCs w:val="1"/>
+          <w:rtl w:val="0"/>
+        </w:rPr>
+        <w:t xml:space="preserve">RF-02 (Eliminar):</w:t>
+      </w:r>
+      <w:r>
+        <w:rPr>
+          <w:rFonts w:ascii="Arial" w:cs="Arial" w:eastAsia="Arial" w:hAnsi="Arial"/>
+          <w:rtl w:val="0"/>
+        </w:rPr>
+        <w:t xml:space="preserve"> El sistema debe permitir que el usuario elimine un proceso de los registros hechos cuando este termine o sea cancelado.</w:t>
+      </w:r>
+    </w:p>
+    <w:p>
+      <w:pPr>
+        <w:numPr>
+          <w:ilvl w:val="0"/>
+          <w:numId w:val="5"/>
+        </w:numPr>
+        <w:spacing w:after="0" w:line="276" w:lineRule="auto"/>
+        <w:ind w:left="1440" w:hanging="360"/>
+        <w:rPr>
+          <w:rFonts w:ascii="Arial" w:cs="Arial" w:eastAsia="Arial" w:hAnsi="Arial"/>
+        </w:rPr>
+      </w:pPr>
+      <w:r>
+        <w:rPr>
+          <w:rFonts w:ascii="Arial" w:cs="Arial" w:eastAsia="Arial" w:hAnsi="Arial"/>
+          <w:b w:val="1"/>
+          <w:bCs w:val="1"/>
+          <w:rtl w:val="0"/>
+        </w:rPr>
+        <w:t xml:space="preserve">RF-03 (Buscar):</w:t>
+      </w:r>
+      <w:r>
+        <w:rPr>
+          <w:rFonts w:ascii="Arial" w:cs="Arial" w:eastAsia="Arial" w:hAnsi="Arial"/>
+          <w:rtl w:val="0"/>
+        </w:rPr>
+        <w:t xml:space="preserve"> El sistema debe permitir hacer consultas al usuario y localizar los datos de uno de los procesos utilizando su ID o el nombre como criterio de búsqueda.</w:t>
+      </w:r>
+    </w:p>
+    <w:p>
+      <w:pPr>
+        <w:numPr>
+          <w:ilvl w:val="0"/>
+          <w:numId w:val="5"/>
+        </w:numPr>
+        <w:spacing w:after="0" w:line="276" w:lineRule="auto"/>
+        <w:ind w:left="1440" w:hanging="360"/>
+        <w:rPr>
+          <w:rFonts w:ascii="Arial" w:cs="Arial" w:eastAsia="Arial" w:hAnsi="Arial"/>
+        </w:rPr>
+      </w:pPr>
+      <w:r>
+        <w:rPr>
+          <w:rFonts w:ascii="Arial" w:cs="Arial" w:eastAsia="Arial" w:hAnsi="Arial"/>
+          <w:b w:val="1"/>
+          <w:bCs w:val="1"/>
+          <w:rtl w:val="0"/>
+        </w:rPr>
+        <w:t xml:space="preserve">RF-04 (Modificar Prioridad):</w:t>
+      </w:r>
+      <w:r>
+        <w:rPr>
+          <w:rFonts w:ascii="Arial" w:cs="Arial" w:eastAsia="Arial" w:hAnsi="Arial"/>
+          <w:rtl w:val="0"/>
+        </w:rPr>
+        <w:t xml:space="preserve"> El sistema debe permitir que el usuario actualice el nivel de importancia de cualquiera de los procesos registrados en el sistema para reordenar la ejecución de estos.</w:t>
+      </w:r>
+    </w:p>
+    <w:p>
+      <w:pPr>
+        <w:numPr>
+          <w:ilvl w:val="0"/>
+          <w:numId w:val="5"/>
+        </w:numPr>
+        <w:spacing w:after="0" w:line="276" w:lineRule="auto"/>
+        <w:ind w:left="1440" w:hanging="360"/>
+        <w:rPr>
+          <w:rFonts w:ascii="Arial" w:cs="Arial" w:eastAsia="Arial" w:hAnsi="Arial"/>
+        </w:rPr>
+      </w:pPr>
+      <w:r>
+        <w:rPr>
+          <w:rFonts w:ascii="Arial" w:cs="Arial" w:eastAsia="Arial" w:hAnsi="Arial"/>
+          <w:b w:val="1"/>
+          <w:bCs w:val="1"/>
+          <w:rtl w:val="0"/>
+        </w:rPr>
+        <w:t xml:space="preserve">RF-05 (Planificar CPU):</w:t>
+      </w:r>
+      <w:r>
+        <w:rPr>
+          <w:rFonts w:ascii="Arial" w:cs="Arial" w:eastAsia="Arial" w:hAnsi="Arial"/>
+          <w:rtl w:val="0"/>
+        </w:rPr>
+        <w:t xml:space="preserve"> El sistema debe enviar las tareas a la cola de espera. encargándose de que el proceso con mayor prioridad del registro sea apartado.</w:t>
+      </w:r>
+    </w:p>
+    <w:p>
+      <w:pPr>
+        <w:numPr>
+          <w:ilvl w:val="0"/>
+          <w:numId w:val="5"/>
+        </w:numPr>
+        <w:spacing w:after="0" w:line="276" w:lineRule="auto"/>
+        <w:ind w:left="1440" w:hanging="360"/>
+        <w:rPr>
+          <w:rFonts w:ascii="Arial" w:cs="Arial" w:eastAsia="Arial" w:hAnsi="Arial"/>
+        </w:rPr>
+      </w:pPr>
+      <w:r>
+        <w:rPr>
+          <w:rFonts w:ascii="Arial" w:cs="Arial" w:eastAsia="Arial" w:hAnsi="Arial"/>
+          <w:b w:val="1"/>
+          <w:bCs w:val="1"/>
+          <w:rtl w:val="0"/>
+        </w:rPr>
+        <w:t xml:space="preserve">RF-06 (Gestionar Memoria):</w:t>
+      </w:r>
+      <w:r>
+        <w:rPr>
+          <w:rFonts w:ascii="Arial" w:cs="Arial" w:eastAsia="Arial" w:hAnsi="Arial"/>
+          <w:rtl w:val="0"/>
+        </w:rPr>
+        <w:t xml:space="preserve"> El sistema se encargará de asignar bloques de memoria a las tareas en ejecución y desasignarlos de forma secuencial una vez que ya no se requieran. </w:t>
+      </w:r>
+    </w:p>
+    <w:p>
+      <w:pPr>
+        <w:numPr>
+          <w:ilvl w:val="0"/>
+          <w:numId w:val="5"/>
+        </w:numPr>
+        <w:spacing w:after="0" w:line="276" w:lineRule="auto"/>
+        <w:ind w:left="1440" w:hanging="360"/>
+        <w:rPr>
+          <w:rFonts w:ascii="Arial" w:cs="Arial" w:eastAsia="Arial" w:hAnsi="Arial"/>
+        </w:rPr>
+      </w:pPr>
+      <w:r>
+        <w:rPr>
+          <w:rFonts w:ascii="Arial" w:cs="Arial" w:eastAsia="Arial" w:hAnsi="Arial"/>
+          <w:b w:val="1"/>
+          <w:bCs w:val="1"/>
+          <w:rtl w:val="0"/>
+        </w:rPr>
+        <w:t xml:space="preserve">RF-07 (Mostrar Estado):</w:t>
+      </w:r>
+      <w:r>
+        <w:rPr>
+          <w:rFonts w:ascii="Arial" w:cs="Arial" w:eastAsia="Arial" w:hAnsi="Arial"/>
+          <w:rtl w:val="0"/>
+        </w:rPr>
+        <w:t xml:space="preserve"> El sistema debe desplegar una interfaz donde se refleje la condición actual de los procesos registrados, la situación de la cola de la CPU y el estado del mapa de memoria.</w:t>
+      </w:r>
+    </w:p>
+    <w:p>
+      <w:pPr>
+        <w:numPr>
+          <w:ilvl w:val="0"/>
+          <w:numId w:val="5"/>
+        </w:numPr>
+        <w:spacing w:after="0" w:line="276" w:lineRule="auto"/>
+        <w:ind w:left="1440" w:hanging="360"/>
+        <w:rPr>
+          <w:rFonts w:ascii="Arial" w:cs="Arial" w:eastAsia="Arial" w:hAnsi="Arial"/>
+        </w:rPr>
+      </w:pPr>
+      <w:r>
+        <w:rPr>
+          <w:rFonts w:ascii="Arial" w:cs="Arial" w:eastAsia="Arial" w:hAnsi="Arial"/>
+          <w:b w:val="1"/>
+          <w:bCs w:val="1"/>
+          <w:rtl w:val="0"/>
+        </w:rPr>
+        <w:t xml:space="preserve">RF-08 (Persistencia):</w:t>
+      </w:r>
+      <w:r>
+        <w:rPr>
+          <w:rFonts w:ascii="Arial" w:cs="Arial" w:eastAsia="Arial" w:hAnsi="Arial"/>
+          <w:rtl w:val="0"/>
+        </w:rPr>
+        <w:t xml:space="preserve"> El sistema debe permitir guardar los datos en un archivo local. Así mismo, también debe permitir cargarlos al iniciar la aplicación.</w:t>
+      </w:r>
+    </w:p>
+    <w:p>
+      <w:pPr>
+        <w:spacing w:after="0" w:line="276" w:lineRule="auto"/>
+        <w:ind w:left="1440" w:firstLine="0"/>
+        <w:rPr>
+          <w:rFonts w:ascii="Arial" w:cs="Arial" w:eastAsia="Arial" w:hAnsi="Arial"/>
+        </w:rPr>
+      </w:pPr>
+      <w:r>
+        <w:rPr>
+          <w:rtl w:val="0"/>
+        </w:rPr>
+      </w:r>
+    </w:p>
+    <w:p>
+      <w:pPr>
+        <w:spacing w:after="0" w:line="276" w:lineRule="auto"/>
+        <w:ind w:left="1080" w:hanging="360"/>
+        <w:rPr>
+          <w:rFonts w:ascii="Arial" w:cs="Arial" w:eastAsia="Arial" w:hAnsi="Arial"/>
+        </w:rPr>
+      </w:pPr>
+      <w:r>
+        <w:rPr>
+          <w:rFonts w:ascii="Arial" w:cs="Arial" w:eastAsia="Arial" w:hAnsi="Arial"/>
+          <w:rtl w:val="0"/>
+        </w:rPr>
+        <w:t xml:space="preserve">·         No funcionales</w:t>
       </w:r>
     </w:p>
     <w:p>
@@ -680,28 +1016,316 @@
         </w:numPr>
         <w:spacing w:after="0" w:line="276" w:lineRule="auto"/>
         <w:ind w:left="1440" w:hanging="360"/>
+        <w:rPr>
+          <w:rFonts w:ascii="Arial" w:cs="Arial" w:eastAsia="Arial" w:hAnsi="Arial"/>
+        </w:rPr>
+      </w:pPr>
+      <w:r>
+        <w:rPr>
+          <w:rFonts w:ascii="Arial" w:cs="Arial" w:eastAsia="Arial" w:hAnsi="Arial"/>
+          <w:b w:val="1"/>
+          <w:bCs w:val="1"/>
+          <w:rtl w:val="0"/>
+        </w:rPr>
+        <w:t xml:space="preserve">RNF-01 (Herramienta):</w:t>
+      </w:r>
+      <w:r>
+        <w:rPr>
+          <w:rFonts w:ascii="Arial" w:cs="Arial" w:eastAsia="Arial" w:hAnsi="Arial"/>
+          <w:rtl w:val="0"/>
+        </w:rPr>
+        <w:t xml:space="preserve"> El código será desarrollado por completo en lenguaje C++ utilizando estrictamente el entorno </w:t>
+      </w:r>
+      <w:r>
+        <w:rPr>
+          <w:rFonts w:ascii="Arial" w:cs="Arial" w:eastAsia="Arial" w:hAnsi="Arial"/>
+          <w:b w:val="1"/>
+          <w:bCs w:val="1"/>
+          <w:rtl w:val="0"/>
+        </w:rPr>
+        <w:t xml:space="preserve">DEV C++ </w:t>
+      </w:r>
+      <w:r>
+        <w:rPr>
+          <w:rFonts w:ascii="Arial" w:cs="Arial" w:eastAsia="Arial" w:hAnsi="Arial"/>
+          <w:rtl w:val="0"/>
+        </w:rPr>
+        <w:t xml:space="preserve">como compilador principal.</w:t>
+      </w:r>
+    </w:p>
+    <w:p>
+      <w:pPr>
+        <w:numPr>
+          <w:ilvl w:val="0"/>
+          <w:numId w:val="1"/>
+        </w:numPr>
+        <w:spacing w:after="0" w:line="276" w:lineRule="auto"/>
+        <w:ind w:left="1440" w:hanging="360"/>
+        <w:rPr>
+          <w:rFonts w:ascii="Arial" w:cs="Arial" w:eastAsia="Arial" w:hAnsi="Arial"/>
+        </w:rPr>
+      </w:pPr>
+      <w:r>
+        <w:rPr>
+          <w:rFonts w:ascii="Arial" w:cs="Arial" w:eastAsia="Arial" w:hAnsi="Arial"/>
+          <w:b w:val="1"/>
+          <w:bCs w:val="1"/>
+          <w:rtl w:val="0"/>
+        </w:rPr>
+        <w:t xml:space="preserve">RNF-02 (Interfaz):</w:t>
+      </w:r>
+      <w:r>
+        <w:rPr>
+          <w:rFonts w:ascii="Arial" w:cs="Arial" w:eastAsia="Arial" w:hAnsi="Arial"/>
+          <w:rtl w:val="0"/>
+        </w:rPr>
+        <w:t xml:space="preserve"> El usuario deberá tener una interfaz clara y organizada mediante un menú de opciones en la consola del sistema.</w:t>
+      </w:r>
+    </w:p>
+    <w:p>
+      <w:pPr>
+        <w:numPr>
+          <w:ilvl w:val="0"/>
+          <w:numId w:val="1"/>
+        </w:numPr>
+        <w:spacing w:after="0" w:line="276" w:lineRule="auto"/>
+        <w:ind w:left="1440" w:hanging="360"/>
+        <w:rPr>
+          <w:rFonts w:ascii="Arial" w:cs="Arial" w:eastAsia="Arial" w:hAnsi="Arial"/>
+        </w:rPr>
+      </w:pPr>
+      <w:r>
+        <w:rPr>
+          <w:rFonts w:ascii="Arial" w:cs="Arial" w:eastAsia="Arial" w:hAnsi="Arial"/>
+          <w:b w:val="1"/>
+          <w:bCs w:val="1"/>
+          <w:rtl w:val="0"/>
+        </w:rPr>
+        <w:t xml:space="preserve">RNF-03 (Validación de Datos):</w:t>
+      </w:r>
+      <w:r>
+        <w:rPr>
+          <w:rFonts w:ascii="Arial" w:cs="Arial" w:eastAsia="Arial" w:hAnsi="Arial"/>
+          <w:rtl w:val="0"/>
+        </w:rPr>
+        <w:t xml:space="preserve"> El sistema obligatoriamente debe validar cada entrada que realice el usuario evitando que el programa colapse.</w:t>
+      </w:r>
+    </w:p>
+    <w:p>
+      <w:pPr>
+        <w:spacing w:after="0" w:line="276" w:lineRule="auto"/>
+        <w:ind w:left="720" w:hanging="360"/>
+        <w:rPr>
+          <w:rFonts w:ascii="Arial" w:cs="Arial" w:eastAsia="Arial" w:hAnsi="Arial"/>
+          <w:b w:val="1"/>
+          <w:bCs w:val="1"/>
+        </w:rPr>
+      </w:pPr>
+      <w:r>
+        <w:rPr>
+          <w:rFonts w:ascii="Arial" w:cs="Arial" w:eastAsia="Arial" w:hAnsi="Arial"/>
+          <w:b w:val="1"/>
+          <w:bCs w:val="1"/>
+          <w:rtl w:val="0"/>
+        </w:rPr>
+        <w:t xml:space="preserve">3.</w:t>
+      </w:r>
+      <w:r>
+        <w:rPr>
+          <w:rFonts w:ascii="Arial" w:cs="Arial" w:eastAsia="Arial" w:hAnsi="Arial"/>
+          <w:rtl w:val="0"/>
+        </w:rPr>
+        <w:t xml:space="preserve">       </w:t>
+      </w:r>
+      <w:r>
+        <w:rPr>
+          <w:rFonts w:ascii="Arial" w:cs="Arial" w:eastAsia="Arial" w:hAnsi="Arial"/>
+          <w:b w:val="1"/>
+          <w:bCs w:val="1"/>
+          <w:rtl w:val="0"/>
+        </w:rPr>
+        <w:t xml:space="preserve">Estructuras de datos propuestas</w:t>
+      </w:r>
+    </w:p>
+    <w:p>
+      <w:pPr>
+        <w:spacing w:after="0" w:line="276" w:lineRule="auto"/>
         <w:jc w:val="both"/>
         <w:rPr>
           <w:rFonts w:ascii="Arial" w:cs="Arial" w:eastAsia="Arial" w:hAnsi="Arial"/>
-          <w:i w:val="1"/>
-          <w:iCs w:val="1"/>
-          <w:u w:val="none"/>
-        </w:rPr>
-      </w:pPr>
-      <w:r>
-        <w:rPr>
-          <w:rtl w:val="0"/>
-        </w:rPr>
+        </w:rPr>
+      </w:pPr>
+      <w:r>
+        <w:rPr>
+          <w:rFonts w:ascii="Arial" w:cs="Arial" w:eastAsia="Arial" w:hAnsi="Arial"/>
+          <w:rtl w:val="0"/>
+        </w:rPr>
+        <w:t xml:space="preserve">Para representar el flujo del sistema operativo en la memoria RAM, se define una estructura base (struct) que actuará como el contenedor de cada proceso.</w:t>
+      </w:r>
+    </w:p>
+    <w:p>
+      <w:pPr>
+        <w:spacing w:after="0" w:line="276" w:lineRule="auto"/>
+        <w:jc w:val="both"/>
+        <w:rPr>
+          <w:rFonts w:ascii="Arial" w:cs="Arial" w:eastAsia="Arial" w:hAnsi="Arial"/>
+        </w:rPr>
+      </w:pPr>
+      <w:r>
+        <w:rPr>
+          <w:rtl w:val="0"/>
+        </w:rPr>
+      </w:r>
+    </w:p>
+    <w:p>
+      <w:pPr>
+        <w:ind w:firstLine="720"/>
+        <w:jc w:val="both"/>
+        <w:rPr>
+          <w:rFonts w:ascii="Arial" w:cs="Arial" w:eastAsia="Arial" w:hAnsi="Arial"/>
+        </w:rPr>
+      </w:pPr>
+      <w:r>
+        <w:rPr>
+          <w:rFonts w:ascii="Arial" w:cs="Arial" w:eastAsia="Arial" w:hAnsi="Arial"/>
+          <w:rtl w:val="0"/>
+        </w:rPr>
+        <w:t xml:space="preserve">struct NodoProceso {</w:t>
+        <w:br w:type="textWrapping"/>
+        <w:t xml:space="preserve">id;                 </w:t>
+        <w:tab/>
+        <w:tab/>
+        <w:tab/>
+        <w:t xml:space="preserve">    // Identificador único del proceso</w:t>
+        <w:br w:type="textWrapping"/>
+        <w:t xml:space="preserve">string nombre;          </w:t>
+        <w:tab/>
+        <w:tab/>
+        <w:t xml:space="preserve">   // Nombre de la aplicación</w:t>
+        <w:br w:type="textWrapping"/>
+        <w:t xml:space="preserve">int prioridad;          </w:t>
+        <w:tab/>
+        <w:tab/>
+        <w:t xml:space="preserve">  // Nivel de importancia (ej: 1 = Alta, 3 = Baja)</w:t>
+        <w:br w:type="textWrapping"/>
+        <w:t xml:space="preserve">int memoria;           </w:t>
+        <w:tab/>
+        <w:tab/>
+        <w:t xml:space="preserve"> // Cantidad de bloques de memoria consumidos</w:t>
+        <w:br w:type="textWrapping"/>
+      </w:r>
+      <w:r>
+        <w:rPr>
+          <w:rFonts w:ascii="Arial" w:cs="Arial" w:eastAsia="Arial" w:hAnsi="Arial"/>
+          <w:rtl w:val="0"/>
+        </w:rPr>
+        <w:t xml:space="preserve">NodoProceso</w:t>
+      </w:r>
+      <w:r>
+        <w:rPr>
+          <w:rFonts w:ascii="Arial" w:cs="Arial" w:eastAsia="Arial" w:hAnsi="Arial"/>
+          <w:rtl w:val="0"/>
+        </w:rPr>
+        <w:t xml:space="preserve">* siguiente; </w:t>
+        <w:tab/>
+        <w:t xml:space="preserve">// Puntero de enlace al próximo nodo</w:t>
+        <w:br w:type="textWrapping"/>
+        <w:t xml:space="preserve">};</w:t>
+      </w:r>
+    </w:p>
+    <w:p>
+      <w:pPr>
+        <w:jc w:val="both"/>
+        <w:rPr>
+          <w:rFonts w:ascii="Arial" w:cs="Arial" w:eastAsia="Arial" w:hAnsi="Arial"/>
+        </w:rPr>
+      </w:pPr>
+      <w:r>
+        <w:rPr>
+          <w:rFonts w:ascii="Arial" w:cs="Arial" w:eastAsia="Arial" w:hAnsi="Arial"/>
+          <w:rtl w:val="0"/>
+        </w:rPr>
+        <w:t xml:space="preserve">A partir de esta struct base, se unirán las tres estructuras dinámicas lineales obligatorias:  </w:t>
+      </w:r>
+    </w:p>
+    <w:p>
+      <w:pPr>
+        <w:numPr>
+          <w:ilvl w:val="0"/>
+          <w:numId w:val="3"/>
+        </w:numPr>
+        <w:spacing w:after="0" w:afterAutospacing="0"/>
+        <w:ind w:left="720" w:hanging="360"/>
+        <w:jc w:val="both"/>
+        <w:rPr>
+          <w:rFonts w:ascii="Arial" w:cs="Arial" w:eastAsia="Arial" w:hAnsi="Arial"/>
+          <w:color w:val="000000"/>
+          <w:sz w:val="22"/>
+          <w:szCs w:val="22"/>
+        </w:rPr>
+      </w:pPr>
+      <w:r>
+        <w:rPr>
+          <w:rFonts w:ascii="Arial" w:cs="Arial" w:eastAsia="Arial" w:hAnsi="Arial"/>
+          <w:rtl w:val="0"/>
+        </w:rPr>
+        <w:t xml:space="preserve">Lista Enlazada Simple: Para el registro general y manipulación de procesos.</w:t>
+      </w:r>
+    </w:p>
+    <w:p>
+      <w:pPr>
+        <w:numPr>
+          <w:ilvl w:val="0"/>
+          <w:numId w:val="3"/>
+        </w:numPr>
+        <w:spacing w:after="0" w:afterAutospacing="0"/>
+        <w:ind w:left="720" w:hanging="360"/>
+        <w:jc w:val="both"/>
+        <w:rPr>
+          <w:rFonts w:ascii="Arial" w:cs="Arial" w:eastAsia="Arial" w:hAnsi="Arial"/>
+          <w:color w:val="000000"/>
+          <w:sz w:val="22"/>
+          <w:szCs w:val="22"/>
+        </w:rPr>
+      </w:pPr>
+      <w:r>
+        <w:rPr>
+          <w:rFonts w:ascii="Arial" w:cs="Arial" w:eastAsia="Arial" w:hAnsi="Arial"/>
+          <w:rtl w:val="0"/>
+        </w:rPr>
+        <w:t xml:space="preserve">Cola de Prioridad: Para la simulación del despacho de tareas a la CPU.</w:t>
+      </w:r>
+    </w:p>
+    <w:p>
+      <w:pPr>
+        <w:numPr>
+          <w:ilvl w:val="0"/>
+          <w:numId w:val="3"/>
+        </w:numPr>
+        <w:ind w:left="720" w:hanging="360"/>
+        <w:jc w:val="both"/>
+        <w:rPr>
+          <w:rFonts w:ascii="Arial" w:cs="Arial" w:eastAsia="Arial" w:hAnsi="Arial"/>
+          <w:color w:val="000000"/>
+          <w:sz w:val="22"/>
+          <w:szCs w:val="22"/>
+        </w:rPr>
+      </w:pPr>
+      <w:r>
+        <w:rPr>
+          <w:rFonts w:ascii="Arial" w:cs="Arial" w:eastAsia="Arial" w:hAnsi="Arial"/>
+          <w:rtl w:val="0"/>
+        </w:rPr>
+        <w:t xml:space="preserve">Pila Dinámica (Stack): Para la asignación jerárquica de bloques de memoria. </w:t>
       </w:r>
     </w:p>
     <w:p>
       <w:pPr>
         <w:spacing w:line="276" w:lineRule="auto"/>
-        <w:ind w:left="720" w:hanging="360"/>
-        <w:rPr>
-          <w:rFonts w:ascii="Arial" w:cs="Arial" w:eastAsia="Arial" w:hAnsi="Arial"/>
-          <w:b w:val="1"/>
-          <w:bCs w:val="1"/>
+        <w:ind w:left="720" w:firstLine="0"/>
+        <w:jc w:val="both"/>
+        <w:rPr>
+          <w:rFonts w:ascii="Arial" w:cs="Arial" w:eastAsia="Arial" w:hAnsi="Arial"/>
         </w:rPr>
       </w:pPr>
       <w:r>
@@ -867,6 +1491,480 @@
           <w:rtl w:val="0"/>
         </w:rPr>
         <w:t xml:space="preserve">Plan de Trabajo y Roles Asignados</w:t>
+      </w:r>
+    </w:p>
+    <w:p>
+      <w:pPr>
+        <w:spacing w:after="0" w:lineRule="auto"/>
+        <w:ind w:left="720" w:hanging="360"/>
+        <w:rPr>
+          <w:rFonts w:ascii="Arial" w:cs="Arial" w:eastAsia="Arial" w:hAnsi="Arial"/>
+          <w:b w:val="1"/>
+          <w:bCs w:val="1"/>
+        </w:rPr>
+      </w:pPr>
+      <w:r>
+        <w:rPr>
+          <w:rtl w:val="0"/>
+        </w:rPr>
+      </w:r>
+    </w:p>
+    <w:p>
+      <w:pPr>
+        <w:spacing w:after="0" w:lineRule="auto"/>
+        <w:ind w:left="720" w:hanging="360"/>
+        <w:rPr>
+          <w:rFonts w:ascii="Arial" w:cs="Arial" w:eastAsia="Arial" w:hAnsi="Arial"/>
+          <w:b w:val="1"/>
+          <w:bCs w:val="1"/>
+        </w:rPr>
+      </w:pPr>
+      <w:r>
+        <w:rPr>
+          <w:rFonts w:ascii="Arial" w:cs="Arial" w:eastAsia="Arial" w:hAnsi="Arial"/>
+          <w:b w:val="1"/>
+          <w:bCs w:val="1"/>
+          <w:rtl w:val="0"/>
+        </w:rPr>
+        <w:t xml:space="preserve">Roles:</w:t>
+      </w:r>
+    </w:p>
+    <w:tbl>
+      <w:tblPr>
+        <w:tblStyle w:val="Table1"/>
+        <w:tblW w:w="8503.511811023624" w:type="dxa"/>
+        <w:jc w:val="left"/>
+        <w:tblBorders>
+          <w:top w:color="000000" w:space="0" w:sz="0" w:val="nil"/>
+          <w:left w:color="000000" w:space="0" w:sz="0" w:val="nil"/>
+          <w:bottom w:color="000000" w:space="0" w:sz="0" w:val="nil"/>
+          <w:right w:color="000000" w:space="0" w:sz="0" w:val="nil"/>
+          <w:insideH w:color="000000" w:space="0" w:sz="0" w:val="nil"/>
+          <w:insideV w:color="000000" w:space="0" w:sz="0" w:val="nil"/>
+        </w:tblBorders>
+        <w:tblLayout w:type="fixed"/>
+        <w:tblLook w:val="0600"/>
+      </w:tblPr>
+      <w:tblGrid>
+        <w:gridCol w:w="4251.755905511812"/>
+        <w:gridCol w:w="4251.755905511812"/>
+        <w:tblGridChange w:id="0">
+          <w:tblGrid>
+            <w:gridCol w:w="4251.755905511812"/>
+            <w:gridCol w:w="4251.755905511812"/>
+          </w:tblGrid>
+        </w:tblGridChange>
+      </w:tblGrid>
+      <w:tr>
+        <w:trPr>
+          <w:cantSplit w:val="0"/>
+          <w:trHeight w:val="300" w:hRule="atLeast"/>
+          <w:tblHeader w:val="0"/>
+        </w:trPr>
+        <w:tc>
+          <w:tcPr>
+            <w:tcBorders>
+              <w:top w:color="000000" w:space="0" w:sz="7" w:val="single"/>
+              <w:left w:color="000000" w:space="0" w:sz="7" w:val="single"/>
+              <w:bottom w:color="000000" w:space="0" w:sz="7" w:val="single"/>
+              <w:right w:color="000000" w:space="0" w:sz="7" w:val="single"/>
+            </w:tcBorders>
+            <w:tcMar>
+              <w:top w:w="0.0" w:type="dxa"/>
+              <w:left w:w="100.0" w:type="dxa"/>
+              <w:bottom w:w="0.0" w:type="dxa"/>
+              <w:right w:w="100.0" w:type="dxa"/>
+            </w:tcMar>
+            <w:vAlign w:val="top"/>
+          </w:tcPr>
+          <w:p>
+            <w:pPr>
+              <w:spacing w:after="0" w:line="276" w:lineRule="auto"/>
+              <w:rPr>
+                <w:rFonts w:ascii="Arial" w:cs="Arial" w:eastAsia="Arial" w:hAnsi="Arial"/>
+                <w:b w:val="1"/>
+                <w:bCs w:val="1"/>
+              </w:rPr>
+            </w:pPr>
+            <w:r>
+              <w:rPr>
+                <w:rFonts w:ascii="Arial" w:cs="Arial" w:eastAsia="Arial" w:hAnsi="Arial"/>
+                <w:b w:val="1"/>
+                <w:bCs w:val="1"/>
+                <w:rtl w:val="0"/>
+              </w:rPr>
+              <w:t xml:space="preserve">Integrantes</w:t>
+            </w:r>
+          </w:p>
+        </w:tc>
+        <w:tc>
+          <w:tcPr>
+            <w:tcBorders>
+              <w:top w:color="000000" w:space="0" w:sz="7" w:val="single"/>
+              <w:left w:color="000000" w:space="0" w:sz="0" w:val="nil"/>
+              <w:bottom w:color="000000" w:space="0" w:sz="7" w:val="single"/>
+              <w:right w:color="000000" w:space="0" w:sz="7" w:val="single"/>
+            </w:tcBorders>
+            <w:tcMar>
+              <w:top w:w="0.0" w:type="dxa"/>
+              <w:left w:w="100.0" w:type="dxa"/>
+              <w:bottom w:w="0.0" w:type="dxa"/>
+              <w:right w:w="100.0" w:type="dxa"/>
+            </w:tcMar>
+            <w:vAlign w:val="top"/>
+          </w:tcPr>
+          <w:p>
+            <w:pPr>
+              <w:spacing w:after="0" w:line="276" w:lineRule="auto"/>
+              <w:rPr>
+                <w:rFonts w:ascii="Arial" w:cs="Arial" w:eastAsia="Arial" w:hAnsi="Arial"/>
+                <w:b w:val="1"/>
+                <w:bCs w:val="1"/>
+              </w:rPr>
+            </w:pPr>
+            <w:r>
+              <w:rPr>
+                <w:rFonts w:ascii="Arial" w:cs="Arial" w:eastAsia="Arial" w:hAnsi="Arial"/>
+                <w:b w:val="1"/>
+                <w:bCs w:val="1"/>
+                <w:rtl w:val="0"/>
+              </w:rPr>
+              <w:t xml:space="preserve">Roles</w:t>
+            </w:r>
+          </w:p>
+        </w:tc>
+      </w:tr>
+      <w:tr>
+        <w:trPr>
+          <w:cantSplit w:val="0"/>
+          <w:trHeight w:val="300" w:hRule="atLeast"/>
+          <w:tblHeader w:val="0"/>
+        </w:trPr>
+        <w:tc>
+          <w:tcPr>
+            <w:tcBorders>
+              <w:top w:color="000000" w:space="0" w:sz="0" w:val="nil"/>
+              <w:left w:color="000000" w:space="0" w:sz="7" w:val="single"/>
+              <w:bottom w:color="000000" w:space="0" w:sz="7" w:val="single"/>
+              <w:right w:color="000000" w:space="0" w:sz="7" w:val="single"/>
+            </w:tcBorders>
+            <w:tcMar>
+              <w:top w:w="0.0" w:type="dxa"/>
+              <w:left w:w="100.0" w:type="dxa"/>
+              <w:bottom w:w="0.0" w:type="dxa"/>
+              <w:right w:w="100.0" w:type="dxa"/>
+            </w:tcMar>
+            <w:vAlign w:val="top"/>
+          </w:tcPr>
+          <w:p>
+            <w:pPr>
+              <w:spacing w:after="0" w:line="276" w:lineRule="auto"/>
+              <w:rPr>
+                <w:rFonts w:ascii="Arial" w:cs="Arial" w:eastAsia="Arial" w:hAnsi="Arial"/>
+                <w:b w:val="1"/>
+                <w:bCs w:val="1"/>
+              </w:rPr>
+            </w:pPr>
+            <w:r>
+              <w:rPr>
+                <w:rFonts w:ascii="Arial" w:cs="Arial" w:eastAsia="Arial" w:hAnsi="Arial"/>
+                <w:b w:val="1"/>
+                <w:bCs w:val="1"/>
+                <w:rtl w:val="0"/>
+              </w:rPr>
+              <w:t xml:space="preserve">Chanco Chambergo Jhymm</w:t>
+            </w:r>
+          </w:p>
+        </w:tc>
+        <w:tc>
+          <w:tcPr>
+            <w:tcBorders>
+              <w:top w:color="000000" w:space="0" w:sz="0" w:val="nil"/>
+              <w:left w:color="000000" w:space="0" w:sz="0" w:val="nil"/>
+              <w:bottom w:color="000000" w:space="0" w:sz="7" w:val="single"/>
+              <w:right w:color="000000" w:space="0" w:sz="7" w:val="single"/>
+            </w:tcBorders>
+            <w:tcMar>
+              <w:top w:w="0.0" w:type="dxa"/>
+              <w:left w:w="100.0" w:type="dxa"/>
+              <w:bottom w:w="0.0" w:type="dxa"/>
+              <w:right w:w="100.0" w:type="dxa"/>
+            </w:tcMar>
+            <w:vAlign w:val="top"/>
+          </w:tcPr>
+          <w:p>
+            <w:pPr>
+              <w:spacing w:after="0" w:line="276" w:lineRule="auto"/>
+              <w:rPr>
+                <w:rFonts w:ascii="Arial" w:cs="Arial" w:eastAsia="Arial" w:hAnsi="Arial"/>
+                <w:b w:val="1"/>
+                <w:bCs w:val="1"/>
+              </w:rPr>
+            </w:pPr>
+            <w:r>
+              <w:rPr>
+                <w:rFonts w:ascii="Arial" w:cs="Arial" w:eastAsia="Arial" w:hAnsi="Arial"/>
+                <w:b w:val="1"/>
+                <w:bCs w:val="1"/>
+                <w:rtl w:val="0"/>
+              </w:rPr>
+              <w:t xml:space="preserve">Descripción del problema</w:t>
+            </w:r>
+          </w:p>
+        </w:tc>
+      </w:tr>
+      <w:tr>
+        <w:trPr>
+          <w:cantSplit w:val="0"/>
+          <w:trHeight w:val="300" w:hRule="atLeast"/>
+          <w:tblHeader w:val="0"/>
+        </w:trPr>
+        <w:tc>
+          <w:tcPr>
+            <w:tcBorders>
+              <w:top w:color="000000" w:space="0" w:sz="0" w:val="nil"/>
+              <w:left w:color="000000" w:space="0" w:sz="7" w:val="single"/>
+              <w:bottom w:color="000000" w:space="0" w:sz="7" w:val="single"/>
+              <w:right w:color="000000" w:space="0" w:sz="7" w:val="single"/>
+            </w:tcBorders>
+            <w:tcMar>
+              <w:top w:w="0.0" w:type="dxa"/>
+              <w:left w:w="100.0" w:type="dxa"/>
+              <w:bottom w:w="0.0" w:type="dxa"/>
+              <w:right w:w="100.0" w:type="dxa"/>
+            </w:tcMar>
+            <w:vAlign w:val="top"/>
+          </w:tcPr>
+          <w:p>
+            <w:pPr>
+              <w:spacing w:after="0" w:line="276" w:lineRule="auto"/>
+              <w:rPr>
+                <w:rFonts w:ascii="Arial" w:cs="Arial" w:eastAsia="Arial" w:hAnsi="Arial"/>
+                <w:b w:val="1"/>
+                <w:bCs w:val="1"/>
+              </w:rPr>
+            </w:pPr>
+            <w:r>
+              <w:rPr>
+                <w:rFonts w:ascii="Arial" w:cs="Arial" w:eastAsia="Arial" w:hAnsi="Arial"/>
+                <w:b w:val="1"/>
+                <w:bCs w:val="1"/>
+                <w:rtl w:val="0"/>
+              </w:rPr>
+              <w:t xml:space="preserve">Tacza Paredes Diego</w:t>
+            </w:r>
+          </w:p>
+        </w:tc>
+        <w:tc>
+          <w:tcPr>
+            <w:tcBorders>
+              <w:top w:color="000000" w:space="0" w:sz="0" w:val="nil"/>
+              <w:left w:color="000000" w:space="0" w:sz="0" w:val="nil"/>
+              <w:bottom w:color="000000" w:space="0" w:sz="7" w:val="single"/>
+              <w:right w:color="000000" w:space="0" w:sz="7" w:val="single"/>
+            </w:tcBorders>
+            <w:tcMar>
+              <w:top w:w="0.0" w:type="dxa"/>
+              <w:left w:w="100.0" w:type="dxa"/>
+              <w:bottom w:w="0.0" w:type="dxa"/>
+              <w:right w:w="100.0" w:type="dxa"/>
+            </w:tcMar>
+            <w:vAlign w:val="top"/>
+          </w:tcPr>
+          <w:p>
+            <w:pPr>
+              <w:spacing w:after="0" w:line="276" w:lineRule="auto"/>
+              <w:rPr>
+                <w:rFonts w:ascii="Arial" w:cs="Arial" w:eastAsia="Arial" w:hAnsi="Arial"/>
+                <w:b w:val="1"/>
+                <w:bCs w:val="1"/>
+              </w:rPr>
+            </w:pPr>
+            <w:r>
+              <w:rPr>
+                <w:rFonts w:ascii="Arial" w:cs="Arial" w:eastAsia="Arial" w:hAnsi="Arial"/>
+                <w:b w:val="1"/>
+                <w:bCs w:val="1"/>
+                <w:rtl w:val="0"/>
+              </w:rPr>
+              <w:t xml:space="preserve">Requerimientos del sistema</w:t>
+            </w:r>
+          </w:p>
+        </w:tc>
+      </w:tr>
+      <w:tr>
+        <w:trPr>
+          <w:cantSplit w:val="0"/>
+          <w:trHeight w:val="300" w:hRule="atLeast"/>
+          <w:tblHeader w:val="0"/>
+        </w:trPr>
+        <w:tc>
+          <w:tcPr>
+            <w:tcBorders>
+              <w:top w:color="000000" w:space="0" w:sz="0" w:val="nil"/>
+              <w:left w:color="000000" w:space="0" w:sz="7" w:val="single"/>
+              <w:bottom w:color="000000" w:space="0" w:sz="7" w:val="single"/>
+              <w:right w:color="000000" w:space="0" w:sz="7" w:val="single"/>
+            </w:tcBorders>
+            <w:tcMar>
+              <w:top w:w="0.0" w:type="dxa"/>
+              <w:left w:w="100.0" w:type="dxa"/>
+              <w:bottom w:w="0.0" w:type="dxa"/>
+              <w:right w:w="100.0" w:type="dxa"/>
+            </w:tcMar>
+            <w:vAlign w:val="top"/>
+          </w:tcPr>
+          <w:p>
+            <w:pPr>
+              <w:spacing w:after="0" w:line="276" w:lineRule="auto"/>
+              <w:rPr>
+                <w:rFonts w:ascii="Arial" w:cs="Arial" w:eastAsia="Arial" w:hAnsi="Arial"/>
+                <w:b w:val="1"/>
+                <w:bCs w:val="1"/>
+              </w:rPr>
+            </w:pPr>
+            <w:r>
+              <w:rPr>
+                <w:rFonts w:ascii="Arial" w:cs="Arial" w:eastAsia="Arial" w:hAnsi="Arial"/>
+                <w:b w:val="1"/>
+                <w:bCs w:val="1"/>
+                <w:rtl w:val="0"/>
+              </w:rPr>
+              <w:t xml:space="preserve">Parque Ñiquen Angel</w:t>
+            </w:r>
+          </w:p>
+        </w:tc>
+        <w:tc>
+          <w:tcPr>
+            <w:tcBorders>
+              <w:top w:color="000000" w:space="0" w:sz="0" w:val="nil"/>
+              <w:left w:color="000000" w:space="0" w:sz="0" w:val="nil"/>
+              <w:bottom w:color="000000" w:space="0" w:sz="7" w:val="single"/>
+              <w:right w:color="000000" w:space="0" w:sz="7" w:val="single"/>
+            </w:tcBorders>
+            <w:tcMar>
+              <w:top w:w="0.0" w:type="dxa"/>
+              <w:left w:w="100.0" w:type="dxa"/>
+              <w:bottom w:w="0.0" w:type="dxa"/>
+              <w:right w:w="100.0" w:type="dxa"/>
+            </w:tcMar>
+            <w:vAlign w:val="top"/>
+          </w:tcPr>
+          <w:p>
+            <w:pPr>
+              <w:spacing w:after="0" w:line="276" w:lineRule="auto"/>
+              <w:rPr>
+                <w:rFonts w:ascii="Arial" w:cs="Arial" w:eastAsia="Arial" w:hAnsi="Arial"/>
+                <w:b w:val="1"/>
+                <w:bCs w:val="1"/>
+              </w:rPr>
+            </w:pPr>
+            <w:r>
+              <w:rPr>
+                <w:rFonts w:ascii="Arial" w:cs="Arial" w:eastAsia="Arial" w:hAnsi="Arial"/>
+                <w:b w:val="1"/>
+                <w:bCs w:val="1"/>
+                <w:rtl w:val="0"/>
+              </w:rPr>
+              <w:t xml:space="preserve">Estructuras de datos propuestas</w:t>
+            </w:r>
+          </w:p>
+        </w:tc>
+      </w:tr>
+      <w:tr>
+        <w:trPr>
+          <w:cantSplit w:val="0"/>
+          <w:trHeight w:val="300" w:hRule="atLeast"/>
+          <w:tblHeader w:val="0"/>
+        </w:trPr>
+        <w:tc>
+          <w:tcPr>
+            <w:tcBorders>
+              <w:top w:color="000000" w:space="0" w:sz="0" w:val="nil"/>
+              <w:left w:color="000000" w:space="0" w:sz="7" w:val="single"/>
+              <w:bottom w:color="000000" w:space="0" w:sz="7" w:val="single"/>
+              <w:right w:color="000000" w:space="0" w:sz="7" w:val="single"/>
+            </w:tcBorders>
+            <w:tcMar>
+              <w:top w:w="0.0" w:type="dxa"/>
+              <w:left w:w="100.0" w:type="dxa"/>
+              <w:bottom w:w="0.0" w:type="dxa"/>
+              <w:right w:w="100.0" w:type="dxa"/>
+            </w:tcMar>
+            <w:vAlign w:val="top"/>
+          </w:tcPr>
+          <w:p>
+            <w:pPr>
+              <w:spacing w:after="0" w:line="276" w:lineRule="auto"/>
+              <w:rPr>
+                <w:rFonts w:ascii="Arial" w:cs="Arial" w:eastAsia="Arial" w:hAnsi="Arial"/>
+                <w:b w:val="1"/>
+                <w:bCs w:val="1"/>
+              </w:rPr>
+            </w:pPr>
+            <w:r>
+              <w:rPr>
+                <w:rFonts w:ascii="Arial" w:cs="Arial" w:eastAsia="Arial" w:hAnsi="Arial"/>
+                <w:b w:val="1"/>
+                <w:bCs w:val="1"/>
+                <w:rtl w:val="0"/>
+              </w:rPr>
+              <w:t xml:space="preserve">Cuba Perez Jhosep</w:t>
+            </w:r>
+          </w:p>
+        </w:tc>
+        <w:tc>
+          <w:tcPr>
+            <w:tcBorders>
+              <w:top w:color="000000" w:space="0" w:sz="0" w:val="nil"/>
+              <w:left w:color="000000" w:space="0" w:sz="0" w:val="nil"/>
+              <w:bottom w:color="000000" w:space="0" w:sz="7" w:val="single"/>
+              <w:right w:color="000000" w:space="0" w:sz="7" w:val="single"/>
+            </w:tcBorders>
+            <w:tcMar>
+              <w:top w:w="0.0" w:type="dxa"/>
+              <w:left w:w="100.0" w:type="dxa"/>
+              <w:bottom w:w="0.0" w:type="dxa"/>
+              <w:right w:w="100.0" w:type="dxa"/>
+            </w:tcMar>
+            <w:vAlign w:val="top"/>
+          </w:tcPr>
+          <w:p>
+            <w:pPr>
+              <w:spacing w:after="0" w:line="276" w:lineRule="auto"/>
+              <w:rPr>
+                <w:rFonts w:ascii="Arial" w:cs="Arial" w:eastAsia="Arial" w:hAnsi="Arial"/>
+                <w:b w:val="1"/>
+                <w:bCs w:val="1"/>
+              </w:rPr>
+            </w:pPr>
+            <w:r>
+              <w:rPr>
+                <w:rFonts w:ascii="Arial" w:cs="Arial" w:eastAsia="Arial" w:hAnsi="Arial"/>
+                <w:b w:val="1"/>
+                <w:bCs w:val="1"/>
+                <w:rtl w:val="0"/>
+              </w:rPr>
+              <w:t xml:space="preserve">Justificación</w:t>
+            </w:r>
+          </w:p>
+        </w:tc>
+      </w:tr>
+    </w:tbl>
+    <w:p>
+      <w:pPr>
+        <w:spacing w:after="0" w:lineRule="auto"/>
+        <w:ind w:left="720" w:hanging="360"/>
+        <w:rPr>
+          <w:rFonts w:ascii="Arial" w:cs="Arial" w:eastAsia="Arial" w:hAnsi="Arial"/>
+          <w:b w:val="1"/>
+          <w:bCs w:val="1"/>
+        </w:rPr>
+      </w:pPr>
+      <w:r>
+        <w:rPr>
+          <w:rtl w:val="0"/>
+        </w:rPr>
       </w:r>
     </w:p>
     <w:p>
@@ -970,7 +2068,7 @@
     <w:lvl w:ilvl="0">
       <w:start w:val="1"/>
       <w:numFmt w:val="bullet"/>
-      <w:lvlText w:val="-"/>
+      <w:lvlText w:val="●"/>
       <w:lvlJc w:val="left"/>
       <w:pPr>
         <w:ind w:left="1440" w:hanging="360"/>
@@ -982,7 +2080,7 @@
     <w:lvl w:ilvl="1">
       <w:start w:val="1"/>
       <w:numFmt w:val="bullet"/>
-      <w:lvlText w:val="-"/>
+      <w:lvlText w:val="○"/>
       <w:lvlJc w:val="left"/>
       <w:pPr>
         <w:ind w:left="2160" w:hanging="360"/>
@@ -994,7 +2092,7 @@
     <w:lvl w:ilvl="2">
       <w:start w:val="1"/>
       <w:numFmt w:val="bullet"/>
-      <w:lvlText w:val="-"/>
+      <w:lvlText w:val="■"/>
       <w:lvlJc w:val="left"/>
       <w:pPr>
         <w:ind w:left="2880" w:hanging="360"/>
@@ -1006,7 +2104,7 @@
     <w:lvl w:ilvl="3">
       <w:start w:val="1"/>
       <w:numFmt w:val="bullet"/>
-      <w:lvlText w:val="-"/>
+      <w:lvlText w:val="●"/>
       <w:lvlJc w:val="left"/>
       <w:pPr>
         <w:ind w:left="3600" w:hanging="360"/>
@@ -1018,7 +2116,7 @@
     <w:lvl w:ilvl="4">
       <w:start w:val="1"/>
       <w:numFmt w:val="bullet"/>
-      <w:lvlText w:val="-"/>
+      <w:lvlText w:val="○"/>
       <w:lvlJc w:val="left"/>
       <w:pPr>
         <w:ind w:left="4320" w:hanging="360"/>
@@ -1030,7 +2128,7 @@
     <w:lvl w:ilvl="5">
       <w:start w:val="1"/>
       <w:numFmt w:val="bullet"/>
-      <w:lvlText w:val="-"/>
+      <w:lvlText w:val="■"/>
       <w:lvlJc w:val="left"/>
       <w:pPr>
         <w:ind w:left="5040" w:hanging="360"/>
@@ -1042,7 +2140,7 @@
     <w:lvl w:ilvl="6">
       <w:start w:val="1"/>
       <w:numFmt w:val="bullet"/>
-      <w:lvlText w:val="-"/>
+      <w:lvlText w:val="●"/>
       <w:lvlJc w:val="left"/>
       <w:pPr>
         <w:ind w:left="5760" w:hanging="360"/>
@@ -1054,7 +2152,7 @@
     <w:lvl w:ilvl="7">
       <w:start w:val="1"/>
       <w:numFmt w:val="bullet"/>
-      <w:lvlText w:val="-"/>
+      <w:lvlText w:val="○"/>
       <w:lvlJc w:val="left"/>
       <w:pPr>
         <w:ind w:left="6480" w:hanging="360"/>
@@ -1066,7 +2164,7 @@
     <w:lvl w:ilvl="8">
       <w:start w:val="1"/>
       <w:numFmt w:val="bullet"/>
-      <w:lvlText w:val="-"/>
+      <w:lvlText w:val="■"/>
       <w:lvlJc w:val="left"/>
       <w:pPr>
         <w:ind w:left="7200" w:hanging="360"/>
@@ -1077,6 +2175,336 @@
     </w:lvl>
   </w:abstractNum>
   <w:abstractNum w:abstractNumId="2">
+    <w:lvl w:ilvl="0">
+      <w:start w:val="1"/>
+      <w:numFmt w:val="bullet"/>
+      <w:lvlText w:val="-"/>
+      <w:lvlJc w:val="left"/>
+      <w:pPr>
+        <w:ind w:left="1440" w:hanging="360"/>
+      </w:pPr>
+      <w:rPr>
+        <w:u w:val="none"/>
+      </w:rPr>
+    </w:lvl>
+    <w:lvl w:ilvl="1">
+      <w:start w:val="1"/>
+      <w:numFmt w:val="bullet"/>
+      <w:lvlText w:val="-"/>
+      <w:lvlJc w:val="left"/>
+      <w:pPr>
+        <w:ind w:left="2160" w:hanging="360"/>
+      </w:pPr>
+      <w:rPr>
+        <w:u w:val="none"/>
+      </w:rPr>
+    </w:lvl>
+    <w:lvl w:ilvl="2">
+      <w:start w:val="1"/>
+      <w:numFmt w:val="bullet"/>
+      <w:lvlText w:val="-"/>
+      <w:lvlJc w:val="left"/>
+      <w:pPr>
+        <w:ind w:left="2880" w:hanging="360"/>
+      </w:pPr>
+      <w:rPr>
+        <w:u w:val="none"/>
+      </w:rPr>
+    </w:lvl>
+    <w:lvl w:ilvl="3">
+      <w:start w:val="1"/>
+      <w:numFmt w:val="bullet"/>
+      <w:lvlText w:val="-"/>
+      <w:lvlJc w:val="left"/>
+      <w:pPr>
+        <w:ind w:left="3600" w:hanging="360"/>
+      </w:pPr>
+      <w:rPr>
+        <w:u w:val="none"/>
+      </w:rPr>
+    </w:lvl>
+    <w:lvl w:ilvl="4">
+      <w:start w:val="1"/>
+      <w:numFmt w:val="bullet"/>
+      <w:lvlText w:val="-"/>
+      <w:lvlJc w:val="left"/>
+      <w:pPr>
+        <w:ind w:left="4320" w:hanging="360"/>
+      </w:pPr>
+      <w:rPr>
+        <w:u w:val="none"/>
+      </w:rPr>
+    </w:lvl>
+    <w:lvl w:ilvl="5">
+      <w:start w:val="1"/>
+      <w:numFmt w:val="bullet"/>
+      <w:lvlText w:val="-"/>
+      <w:lvlJc w:val="left"/>
+      <w:pPr>
+        <w:ind w:left="5040" w:hanging="360"/>
+      </w:pPr>
+      <w:rPr>
+        <w:u w:val="none"/>
+      </w:rPr>
+    </w:lvl>
+    <w:lvl w:ilvl="6">
+      <w:start w:val="1"/>
+      <w:numFmt w:val="bullet"/>
+      <w:lvlText w:val="-"/>
+      <w:lvlJc w:val="left"/>
+      <w:pPr>
+        <w:ind w:left="5760" w:hanging="360"/>
+      </w:pPr>
+      <w:rPr>
+        <w:u w:val="none"/>
+      </w:rPr>
+    </w:lvl>
+    <w:lvl w:ilvl="7">
+      <w:start w:val="1"/>
+      <w:numFmt w:val="bullet"/>
+      <w:lvlText w:val="-"/>
+      <w:lvlJc w:val="left"/>
+      <w:pPr>
+        <w:ind w:left="6480" w:hanging="360"/>
+      </w:pPr>
+      <w:rPr>
+        <w:u w:val="none"/>
+      </w:rPr>
+    </w:lvl>
+    <w:lvl w:ilvl="8">
+      <w:start w:val="1"/>
+      <w:numFmt w:val="bullet"/>
+      <w:lvlText w:val="-"/>
+      <w:lvlJc w:val="left"/>
+      <w:pPr>
+        <w:ind w:left="7200" w:hanging="360"/>
+      </w:pPr>
+      <w:rPr>
+        <w:u w:val="none"/>
+      </w:rPr>
+    </w:lvl>
+  </w:abstractNum>
+  <w:abstractNum w:abstractNumId="3">
+    <w:lvl w:ilvl="0">
+      <w:start w:val="1"/>
+      <w:numFmt w:val="bullet"/>
+      <w:lvlText w:val="-"/>
+      <w:lvlJc w:val="left"/>
+      <w:pPr>
+        <w:ind w:left="720" w:hanging="360"/>
+      </w:pPr>
+      <w:rPr>
+        <w:u w:val="none"/>
+      </w:rPr>
+    </w:lvl>
+    <w:lvl w:ilvl="1">
+      <w:start w:val="1"/>
+      <w:numFmt w:val="bullet"/>
+      <w:lvlText w:val="-"/>
+      <w:lvlJc w:val="left"/>
+      <w:pPr>
+        <w:ind w:left="1440" w:hanging="360"/>
+      </w:pPr>
+      <w:rPr>
+        <w:u w:val="none"/>
+      </w:rPr>
+    </w:lvl>
+    <w:lvl w:ilvl="2">
+      <w:start w:val="1"/>
+      <w:numFmt w:val="bullet"/>
+      <w:lvlText w:val="-"/>
+      <w:lvlJc w:val="left"/>
+      <w:pPr>
+        <w:ind w:left="2160" w:hanging="360"/>
+      </w:pPr>
+      <w:rPr>
+        <w:u w:val="none"/>
+      </w:rPr>
+    </w:lvl>
+    <w:lvl w:ilvl="3">
+      <w:start w:val="1"/>
+      <w:numFmt w:val="bullet"/>
+      <w:lvlText w:val="-"/>
+      <w:lvlJc w:val="left"/>
+      <w:pPr>
+        <w:ind w:left="2880" w:hanging="360"/>
+      </w:pPr>
+      <w:rPr>
+        <w:u w:val="none"/>
+      </w:rPr>
+    </w:lvl>
+    <w:lvl w:ilvl="4">
+      <w:start w:val="1"/>
+      <w:numFmt w:val="bullet"/>
+      <w:lvlText w:val="-"/>
+      <w:lvlJc w:val="left"/>
+      <w:pPr>
+        <w:ind w:left="3600" w:hanging="360"/>
+      </w:pPr>
+      <w:rPr>
+        <w:u w:val="none"/>
+      </w:rPr>
+    </w:lvl>
+    <w:lvl w:ilvl="5">
+      <w:start w:val="1"/>
+      <w:numFmt w:val="bullet"/>
+      <w:lvlText w:val="-"/>
+      <w:lvlJc w:val="left"/>
+      <w:pPr>
+        <w:ind w:left="4320" w:hanging="360"/>
+      </w:pPr>
+      <w:rPr>
+        <w:u w:val="none"/>
+      </w:rPr>
+    </w:lvl>
+    <w:lvl w:ilvl="6">
+      <w:start w:val="1"/>
+      <w:numFmt w:val="bullet"/>
+      <w:lvlText w:val="-"/>
+      <w:lvlJc w:val="left"/>
+      <w:pPr>
+        <w:ind w:left="5040" w:hanging="360"/>
+      </w:pPr>
+      <w:rPr>
+        <w:u w:val="none"/>
+      </w:rPr>
+    </w:lvl>
+    <w:lvl w:ilvl="7">
+      <w:start w:val="1"/>
+      <w:numFmt w:val="bullet"/>
+      <w:lvlText w:val="-"/>
+      <w:lvlJc w:val="left"/>
+      <w:pPr>
+        <w:ind w:left="5760" w:hanging="360"/>
+      </w:pPr>
+      <w:rPr>
+        <w:u w:val="none"/>
+      </w:rPr>
+    </w:lvl>
+    <w:lvl w:ilvl="8">
+      <w:start w:val="1"/>
+      <w:numFmt w:val="bullet"/>
+      <w:lvlText w:val="-"/>
+      <w:lvlJc w:val="left"/>
+      <w:pPr>
+        <w:ind w:left="6480" w:hanging="360"/>
+      </w:pPr>
+      <w:rPr>
+        <w:u w:val="none"/>
+      </w:rPr>
+    </w:lvl>
+  </w:abstractNum>
+  <w:abstractNum w:abstractNumId="4">
+    <w:lvl w:ilvl="0">
+      <w:start w:val="1"/>
+      <w:numFmt w:val="bullet"/>
+      <w:lvlText w:val="●"/>
+      <w:lvlJc w:val="left"/>
+      <w:pPr>
+        <w:ind w:left="1440" w:hanging="360"/>
+      </w:pPr>
+      <w:rPr>
+        <w:u w:val="none"/>
+      </w:rPr>
+    </w:lvl>
+    <w:lvl w:ilvl="1">
+      <w:start w:val="1"/>
+      <w:numFmt w:val="bullet"/>
+      <w:lvlText w:val="○"/>
+      <w:lvlJc w:val="left"/>
+      <w:pPr>
+        <w:ind w:left="2160" w:hanging="360"/>
+      </w:pPr>
+      <w:rPr>
+        <w:u w:val="none"/>
+      </w:rPr>
+    </w:lvl>
+    <w:lvl w:ilvl="2">
+      <w:start w:val="1"/>
+      <w:numFmt w:val="bullet"/>
+      <w:lvlText w:val="■"/>
+      <w:lvlJc w:val="left"/>
+      <w:pPr>
+        <w:ind w:left="2880" w:hanging="360"/>
+      </w:pPr>
+      <w:rPr>
+        <w:u w:val="none"/>
+      </w:rPr>
+    </w:lvl>
+    <w:lvl w:ilvl="3">
+      <w:start w:val="1"/>
+      <w:numFmt w:val="bullet"/>
+      <w:lvlText w:val="●"/>
+      <w:lvlJc w:val="left"/>
+      <w:pPr>
+        <w:ind w:left="3600" w:hanging="360"/>
+      </w:pPr>
+      <w:rPr>
+        <w:u w:val="none"/>
+      </w:rPr>
+    </w:lvl>
+    <w:lvl w:ilvl="4">
+      <w:start w:val="1"/>
+      <w:numFmt w:val="bullet"/>
+      <w:lvlText w:val="○"/>
+      <w:lvlJc w:val="left"/>
+      <w:pPr>
+        <w:ind w:left="4320" w:hanging="360"/>
+      </w:pPr>
+      <w:rPr>
+        <w:u w:val="none"/>
+      </w:rPr>
+    </w:lvl>
+    <w:lvl w:ilvl="5">
+      <w:start w:val="1"/>
+      <w:numFmt w:val="bullet"/>
+      <w:lvlText w:val="■"/>
+      <w:lvlJc w:val="left"/>
+      <w:pPr>
+        <w:ind w:left="5040" w:hanging="360"/>
+      </w:pPr>
+      <w:rPr>
+        <w:u w:val="none"/>
+      </w:rPr>
+    </w:lvl>
+    <w:lvl w:ilvl="6">
+      <w:start w:val="1"/>
+      <w:numFmt w:val="bullet"/>
+      <w:lvlText w:val="●"/>
+      <w:lvlJc w:val="left"/>
+      <w:pPr>
+        <w:ind w:left="5760" w:hanging="360"/>
+      </w:pPr>
+      <w:rPr>
+        <w:u w:val="none"/>
+      </w:rPr>
+    </w:lvl>
+    <w:lvl w:ilvl="7">
+      <w:start w:val="1"/>
+      <w:numFmt w:val="bullet"/>
+      <w:lvlText w:val="○"/>
+      <w:lvlJc w:val="left"/>
+      <w:pPr>
+        <w:ind w:left="6480" w:hanging="360"/>
+      </w:pPr>
+      <w:rPr>
+        <w:u w:val="none"/>
+      </w:rPr>
+    </w:lvl>
+    <w:lvl w:ilvl="8">
+      <w:start w:val="1"/>
+      <w:numFmt w:val="bullet"/>
+      <w:lvlText w:val="■"/>
+      <w:lvlJc w:val="left"/>
+      <w:pPr>
+        <w:ind w:left="7200" w:hanging="360"/>
+      </w:pPr>
+      <w:rPr>
+        <w:u w:val="none"/>
+      </w:rPr>
+    </w:lvl>
+  </w:abstractNum>
+  <w:abstractNum w:abstractNumId="5">
     <w:lvl w:ilvl="0">
       <w:start w:val="1"/>
       <w:numFmt w:val="bullet"/>
@@ -1191,6 +2619,15 @@
   </w:num>
   <w:num w:numId="2">
     <w:abstractNumId w:val="2"/>
+  </w:num>
+  <w:num w:numId="3">
+    <w:abstractNumId w:val="3"/>
+  </w:num>
+  <w:num w:numId="4">
+    <w:abstractNumId w:val="4"/>
+  </w:num>
+  <w:num w:numId="5">
+    <w:abstractNumId w:val="5"/>
   </w:num>
 </w:numbering>
 </file>
@@ -1356,6 +2793,14 @@
       <w:sz w:val="48"/>
       <w:szCs w:val="48"/>
     </w:rPr>
+  </w:style>
+  <w:style w:type="table" w:styleId="Table1">
+    <w:basedOn w:val="TableNormal"/>
+    <w:tblPr>
+      <w:tblStyleRowBandSize w:val="1"/>
+      <w:tblStyleColBandSize w:val="1"/>
+      <w:tblCellMar/>
+    </w:tblPr>
   </w:style>
 </w:styles>
 </file>

</xml_diff>